<commit_message>
feat: generador docx de Anexo 3 rellenando los campos de la plantilla de movimientos
</commit_message>
<xml_diff>
--- a/ActivosFijos/wwwroot/plantillas/Plantilla Anexo 3 Modelo de Mov de AFT. MODELO.docx
+++ b/ActivosFijos/wwwroot/plantillas/Plantilla Anexo 3 Modelo de Mov de AFT. MODELO.docx
@@ -1,6 +1,6 @@
 
 <file path=word/document.xml><?xml version="1.0" encoding="utf-8"?>
-<w:document xmlns:wpc="http://schemas.microsoft.com/office/word/2010/wordprocessingCanvas" xmlns:mc="http://schemas.openxmlformats.org/markup-compatibility/2006" xmlns:o="urn:schemas-microsoft-com:office:office" xmlns:r="http://schemas.openxmlformats.org/officeDocument/2006/relationships" xmlns:m="http://schemas.openxmlformats.org/officeDocument/2006/math" xmlns:v="urn:schemas-microsoft-com:vml" xmlns:wp14="http://schemas.microsoft.com/office/word/2010/wordprocessingDrawing" xmlns:wp="http://schemas.openxmlformats.org/drawingml/2006/wordprocessingDrawing" xmlns:w10="urn:schemas-microsoft-com:office:word" xmlns:w="http://schemas.openxmlformats.org/wordprocessingml/2006/main" xmlns:w14="http://schemas.microsoft.com/office/word/2010/wordml" xmlns:w15="http://schemas.microsoft.com/office/word/2012/wordml" xmlns:wpg="http://schemas.microsoft.com/office/word/2010/wordprocessingGroup" xmlns:wpi="http://schemas.microsoft.com/office/word/2010/wordprocessingInk" xmlns:wne="http://schemas.microsoft.com/office/word/2006/wordml" xmlns:wps="http://schemas.microsoft.com/office/word/2010/wordprocessingShape" mc:Ignorable="w14 w15 wp14">
+<w:document xmlns:wpc="http://schemas.microsoft.com/office/word/2010/wordprocessingCanvas" xmlns:cx="http://schemas.microsoft.com/office/drawing/2014/chartex" xmlns:cx1="http://schemas.microsoft.com/office/drawing/2015/9/8/chartex" xmlns:cx2="http://schemas.microsoft.com/office/drawing/2015/10/21/chartex" xmlns:cx3="http://schemas.microsoft.com/office/drawing/2016/5/9/chartex" xmlns:cx4="http://schemas.microsoft.com/office/drawing/2016/5/10/chartex" xmlns:cx5="http://schemas.microsoft.com/office/drawing/2016/5/11/chartex" xmlns:cx6="http://schemas.microsoft.com/office/drawing/2016/5/12/chartex" xmlns:cx7="http://schemas.microsoft.com/office/drawing/2016/5/13/chartex" xmlns:cx8="http://schemas.microsoft.com/office/drawing/2016/5/14/chartex" xmlns:mc="http://schemas.openxmlformats.org/markup-compatibility/2006" xmlns:aink="http://schemas.microsoft.com/office/drawing/2016/ink" xmlns:am3d="http://schemas.microsoft.com/office/drawing/2017/model3d" xmlns:o="urn:schemas-microsoft-com:office:office" xmlns:oel="http://schemas.microsoft.com/office/2019/extlst" xmlns:r="http://schemas.openxmlformats.org/officeDocument/2006/relationships" xmlns:m="http://schemas.openxmlformats.org/officeDocument/2006/math" xmlns:v="urn:schemas-microsoft-com:vml" xmlns:wp14="http://schemas.microsoft.com/office/word/2010/wordprocessingDrawing" xmlns:wp="http://schemas.openxmlformats.org/drawingml/2006/wordprocessingDrawing" xmlns:w10="urn:schemas-microsoft-com:office:word" xmlns:w="http://schemas.openxmlformats.org/wordprocessingml/2006/main" xmlns:w14="http://schemas.microsoft.com/office/word/2010/wordml" xmlns:w15="http://schemas.microsoft.com/office/word/2012/wordml" xmlns:w16cex="http://schemas.microsoft.com/office/word/2018/wordml/cex" xmlns:w16cid="http://schemas.microsoft.com/office/word/2016/wordml/cid" xmlns:w16="http://schemas.microsoft.com/office/word/2018/wordml" xmlns:w16sdtdh="http://schemas.microsoft.com/office/word/2020/wordml/sdtdatahash" xmlns:w16se="http://schemas.microsoft.com/office/word/2015/wordml/symex" xmlns:wpg="http://schemas.microsoft.com/office/word/2010/wordprocessingGroup" xmlns:wpi="http://schemas.microsoft.com/office/word/2010/wordprocessingInk" xmlns:wne="http://schemas.microsoft.com/office/word/2006/wordml" xmlns:wps="http://schemas.microsoft.com/office/word/2010/wordprocessingShape" mc:Ignorable="w14 w15 w16se w16cid w16 w16cex w16sdtdh wp14">
   <w:body>
     <w:p>
       <w:pPr>
@@ -102,14 +102,25 @@
               </w:rPr>
               <w:t xml:space="preserve">Entidad   </w:t>
             </w:r>
-            <w:r>
-              <w:rPr>
-                <w:rFonts w:ascii="Arial" w:eastAsia="Times New Roman" w:hAnsi="Arial" w:cs="Arial"/>
-                <w:sz w:val="16"/>
-                <w:szCs w:val="16"/>
-                <w:lang w:val="es-ES" w:eastAsia="es-MX"/>
-              </w:rPr>
-              <w:t>UEB ATI SS</w:t>
+            <w:proofErr w:type="spellStart"/>
+            <w:r>
+              <w:rPr>
+                <w:rFonts w:ascii="Arial" w:eastAsia="Times New Roman" w:hAnsi="Arial" w:cs="Arial"/>
+                <w:sz w:val="16"/>
+                <w:szCs w:val="16"/>
+                <w:lang w:val="es-ES" w:eastAsia="es-MX"/>
+              </w:rPr>
+              <w:t>ENTIDAD</w:t>
+            </w:r>
+            <w:proofErr w:type="spellEnd"/>
+            <w:r>
+              <w:rPr>
+                <w:rFonts w:ascii="Arial" w:eastAsia="Times New Roman" w:hAnsi="Arial" w:cs="Arial"/>
+                <w:sz w:val="16"/>
+                <w:szCs w:val="16"/>
+                <w:lang w:val="es-ES" w:eastAsia="es-MX"/>
+              </w:rPr>
+              <w:t>_</w:t>
             </w:r>
           </w:p>
         </w:tc>
@@ -134,6 +145,7 @@
                 <w:lang w:val="es-ES" w:eastAsia="es-MX"/>
               </w:rPr>
             </w:pPr>
+            <w:proofErr w:type="gramStart"/>
             <w:r>
               <w:rPr>
                 <w:rFonts w:ascii="Arial" w:eastAsia="Times New Roman" w:hAnsi="Arial" w:cs="Arial"/>
@@ -150,7 +162,17 @@
                 <w:szCs w:val="16"/>
                 <w:lang w:val="es-ES" w:eastAsia="es-MX"/>
               </w:rPr>
-              <w:t xml:space="preserve">  104-0-13532</w:t>
+              <w:t xml:space="preserve">  104</w:t>
+            </w:r>
+            <w:proofErr w:type="gramEnd"/>
+            <w:r>
+              <w:rPr>
+                <w:rFonts w:ascii="Arial" w:eastAsia="Times New Roman" w:hAnsi="Arial" w:cs="Arial"/>
+                <w:sz w:val="16"/>
+                <w:szCs w:val="16"/>
+                <w:lang w:val="es-ES" w:eastAsia="es-MX"/>
+              </w:rPr>
+              <w:t>-0-13532</w:t>
             </w:r>
           </w:p>
         </w:tc>
@@ -332,7 +354,16 @@
                 <w:szCs w:val="16"/>
                 <w:lang w:val="es-ES" w:eastAsia="es-MX"/>
               </w:rPr>
-              <w:t xml:space="preserve">  Avenida de los Mártires S/N Final Esq. Circunvalante</w:t>
+              <w:t xml:space="preserve">  </w:t>
+            </w:r>
+            <w:r>
+              <w:rPr>
+                <w:rFonts w:ascii="Arial" w:eastAsia="Times New Roman" w:hAnsi="Arial" w:cs="Arial"/>
+                <w:sz w:val="16"/>
+                <w:szCs w:val="16"/>
+                <w:lang w:val="es-ES" w:eastAsia="es-MX"/>
+              </w:rPr>
+              <w:t>DIRECCION_</w:t>
             </w:r>
           </w:p>
         </w:tc>
@@ -518,7 +549,7 @@
                 <w:szCs w:val="16"/>
                 <w:lang w:val="es-ES" w:eastAsia="es-MX"/>
               </w:rPr>
-              <w:t>Generación</w:t>
+              <w:t>AREA_</w:t>
             </w:r>
           </w:p>
         </w:tc>
@@ -1773,7 +1804,7 @@
                 <w:szCs w:val="16"/>
                 <w:lang w:val="es-ES" w:eastAsia="es-MX"/>
               </w:rPr>
-              <w:t>UEB Aplicaciones de Redes (ATI SS)</w:t>
+              <w:t>UEB_</w:t>
             </w:r>
           </w:p>
         </w:tc>
@@ -1860,19 +1891,8 @@
                 <w:szCs w:val="16"/>
                 <w:lang w:val="es-ES" w:eastAsia="es-MX"/>
               </w:rPr>
-              <w:t xml:space="preserve">Avenida de los Mártires S/N Final Esq. </w:t>
-            </w:r>
-            <w:proofErr w:type="spellStart"/>
-            <w:r>
-              <w:rPr>
-                <w:rFonts w:ascii="Arial" w:eastAsia="Times New Roman" w:hAnsi="Arial" w:cs="Arial"/>
-                <w:sz w:val="16"/>
-                <w:szCs w:val="16"/>
-                <w:lang w:val="es-ES" w:eastAsia="es-MX"/>
-              </w:rPr>
-              <w:t>Circunvalante</w:t>
-            </w:r>
-            <w:proofErr w:type="spellEnd"/>
+              <w:t>DIRECCION_UEB_</w:t>
+            </w:r>
           </w:p>
         </w:tc>
       </w:tr>
@@ -4411,12 +4431,9 @@
           </w:p>
         </w:tc>
       </w:tr>
+      <w:bookmarkEnd w:id="0"/>
     </w:tbl>
-    <w:p>
-      <w:bookmarkStart w:id="1" w:name="_GoBack"/>
-      <w:bookmarkEnd w:id="0"/>
-      <w:bookmarkEnd w:id="1"/>
-    </w:p>
+    <w:p/>
     <w:sectPr>
       <w:headerReference w:type="default" r:id="rId7"/>
       <w:pgSz w:w="15840" w:h="12240" w:orient="landscape" w:code="1"/>
@@ -4429,7 +4446,7 @@
 </file>
 
 <file path=word/endnotes.xml><?xml version="1.0" encoding="utf-8"?>
-<w:endnotes xmlns:wpc="http://schemas.microsoft.com/office/word/2010/wordprocessingCanvas" xmlns:mc="http://schemas.openxmlformats.org/markup-compatibility/2006" xmlns:o="urn:schemas-microsoft-com:office:office" xmlns:r="http://schemas.openxmlformats.org/officeDocument/2006/relationships" xmlns:m="http://schemas.openxmlformats.org/officeDocument/2006/math" xmlns:v="urn:schemas-microsoft-com:vml" xmlns:wp14="http://schemas.microsoft.com/office/word/2010/wordprocessingDrawing" xmlns:wp="http://schemas.openxmlformats.org/drawingml/2006/wordprocessingDrawing" xmlns:w10="urn:schemas-microsoft-com:office:word" xmlns:w="http://schemas.openxmlformats.org/wordprocessingml/2006/main" xmlns:w14="http://schemas.microsoft.com/office/word/2010/wordml" xmlns:w15="http://schemas.microsoft.com/office/word/2012/wordml" xmlns:wpg="http://schemas.microsoft.com/office/word/2010/wordprocessingGroup" xmlns:wpi="http://schemas.microsoft.com/office/word/2010/wordprocessingInk" xmlns:wne="http://schemas.microsoft.com/office/word/2006/wordml" xmlns:wps="http://schemas.microsoft.com/office/word/2010/wordprocessingShape" mc:Ignorable="w14 w15 wp14">
+<w:endnotes xmlns:wpc="http://schemas.microsoft.com/office/word/2010/wordprocessingCanvas" xmlns:cx="http://schemas.microsoft.com/office/drawing/2014/chartex" xmlns:cx1="http://schemas.microsoft.com/office/drawing/2015/9/8/chartex" xmlns:cx2="http://schemas.microsoft.com/office/drawing/2015/10/21/chartex" xmlns:cx3="http://schemas.microsoft.com/office/drawing/2016/5/9/chartex" xmlns:cx4="http://schemas.microsoft.com/office/drawing/2016/5/10/chartex" xmlns:cx5="http://schemas.microsoft.com/office/drawing/2016/5/11/chartex" xmlns:cx6="http://schemas.microsoft.com/office/drawing/2016/5/12/chartex" xmlns:cx7="http://schemas.microsoft.com/office/drawing/2016/5/13/chartex" xmlns:cx8="http://schemas.microsoft.com/office/drawing/2016/5/14/chartex" xmlns:mc="http://schemas.openxmlformats.org/markup-compatibility/2006" xmlns:aink="http://schemas.microsoft.com/office/drawing/2016/ink" xmlns:am3d="http://schemas.microsoft.com/office/drawing/2017/model3d" xmlns:o="urn:schemas-microsoft-com:office:office" xmlns:oel="http://schemas.microsoft.com/office/2019/extlst" xmlns:r="http://schemas.openxmlformats.org/officeDocument/2006/relationships" xmlns:m="http://schemas.openxmlformats.org/officeDocument/2006/math" xmlns:v="urn:schemas-microsoft-com:vml" xmlns:wp14="http://schemas.microsoft.com/office/word/2010/wordprocessingDrawing" xmlns:wp="http://schemas.openxmlformats.org/drawingml/2006/wordprocessingDrawing" xmlns:w10="urn:schemas-microsoft-com:office:word" xmlns:w="http://schemas.openxmlformats.org/wordprocessingml/2006/main" xmlns:w14="http://schemas.microsoft.com/office/word/2010/wordml" xmlns:w15="http://schemas.microsoft.com/office/word/2012/wordml" xmlns:w16cex="http://schemas.microsoft.com/office/word/2018/wordml/cex" xmlns:w16cid="http://schemas.microsoft.com/office/word/2016/wordml/cid" xmlns:w16="http://schemas.microsoft.com/office/word/2018/wordml" xmlns:w16sdtdh="http://schemas.microsoft.com/office/word/2020/wordml/sdtdatahash" xmlns:w16se="http://schemas.microsoft.com/office/word/2015/wordml/symex" xmlns:wpg="http://schemas.microsoft.com/office/word/2010/wordprocessingGroup" xmlns:wpi="http://schemas.microsoft.com/office/word/2010/wordprocessingInk" xmlns:wne="http://schemas.microsoft.com/office/word/2006/wordml" xmlns:wps="http://schemas.microsoft.com/office/word/2010/wordprocessingShape" mc:Ignorable="w14 w15 w16se w16cid w16 w16cex w16sdtdh wp14">
   <w:endnote w:type="separator" w:id="-1">
     <w:p>
       <w:pPr>
@@ -4454,7 +4471,7 @@
 </file>
 
 <file path=word/footnotes.xml><?xml version="1.0" encoding="utf-8"?>
-<w:footnotes xmlns:wpc="http://schemas.microsoft.com/office/word/2010/wordprocessingCanvas" xmlns:mc="http://schemas.openxmlformats.org/markup-compatibility/2006" xmlns:o="urn:schemas-microsoft-com:office:office" xmlns:r="http://schemas.openxmlformats.org/officeDocument/2006/relationships" xmlns:m="http://schemas.openxmlformats.org/officeDocument/2006/math" xmlns:v="urn:schemas-microsoft-com:vml" xmlns:wp14="http://schemas.microsoft.com/office/word/2010/wordprocessingDrawing" xmlns:wp="http://schemas.openxmlformats.org/drawingml/2006/wordprocessingDrawing" xmlns:w10="urn:schemas-microsoft-com:office:word" xmlns:w="http://schemas.openxmlformats.org/wordprocessingml/2006/main" xmlns:w14="http://schemas.microsoft.com/office/word/2010/wordml" xmlns:w15="http://schemas.microsoft.com/office/word/2012/wordml" xmlns:wpg="http://schemas.microsoft.com/office/word/2010/wordprocessingGroup" xmlns:wpi="http://schemas.microsoft.com/office/word/2010/wordprocessingInk" xmlns:wne="http://schemas.microsoft.com/office/word/2006/wordml" xmlns:wps="http://schemas.microsoft.com/office/word/2010/wordprocessingShape" mc:Ignorable="w14 w15 wp14">
+<w:footnotes xmlns:wpc="http://schemas.microsoft.com/office/word/2010/wordprocessingCanvas" xmlns:cx="http://schemas.microsoft.com/office/drawing/2014/chartex" xmlns:cx1="http://schemas.microsoft.com/office/drawing/2015/9/8/chartex" xmlns:cx2="http://schemas.microsoft.com/office/drawing/2015/10/21/chartex" xmlns:cx3="http://schemas.microsoft.com/office/drawing/2016/5/9/chartex" xmlns:cx4="http://schemas.microsoft.com/office/drawing/2016/5/10/chartex" xmlns:cx5="http://schemas.microsoft.com/office/drawing/2016/5/11/chartex" xmlns:cx6="http://schemas.microsoft.com/office/drawing/2016/5/12/chartex" xmlns:cx7="http://schemas.microsoft.com/office/drawing/2016/5/13/chartex" xmlns:cx8="http://schemas.microsoft.com/office/drawing/2016/5/14/chartex" xmlns:mc="http://schemas.openxmlformats.org/markup-compatibility/2006" xmlns:aink="http://schemas.microsoft.com/office/drawing/2016/ink" xmlns:am3d="http://schemas.microsoft.com/office/drawing/2017/model3d" xmlns:o="urn:schemas-microsoft-com:office:office" xmlns:oel="http://schemas.microsoft.com/office/2019/extlst" xmlns:r="http://schemas.openxmlformats.org/officeDocument/2006/relationships" xmlns:m="http://schemas.openxmlformats.org/officeDocument/2006/math" xmlns:v="urn:schemas-microsoft-com:vml" xmlns:wp14="http://schemas.microsoft.com/office/word/2010/wordprocessingDrawing" xmlns:wp="http://schemas.openxmlformats.org/drawingml/2006/wordprocessingDrawing" xmlns:w10="urn:schemas-microsoft-com:office:word" xmlns:w="http://schemas.openxmlformats.org/wordprocessingml/2006/main" xmlns:w14="http://schemas.microsoft.com/office/word/2010/wordml" xmlns:w15="http://schemas.microsoft.com/office/word/2012/wordml" xmlns:w16cex="http://schemas.microsoft.com/office/word/2018/wordml/cex" xmlns:w16cid="http://schemas.microsoft.com/office/word/2016/wordml/cid" xmlns:w16="http://schemas.microsoft.com/office/word/2018/wordml" xmlns:w16sdtdh="http://schemas.microsoft.com/office/word/2020/wordml/sdtdatahash" xmlns:w16se="http://schemas.microsoft.com/office/word/2015/wordml/symex" xmlns:wpg="http://schemas.microsoft.com/office/word/2010/wordprocessingGroup" xmlns:wpi="http://schemas.microsoft.com/office/word/2010/wordprocessingInk" xmlns:wne="http://schemas.microsoft.com/office/word/2006/wordml" xmlns:wps="http://schemas.microsoft.com/office/word/2010/wordprocessingShape" mc:Ignorable="w14 w15 w16se w16cid w16 w16cex w16sdtdh wp14">
   <w:footnote w:type="separator" w:id="-1">
     <w:p>
       <w:pPr>
@@ -4479,7 +4496,7 @@
 </file>
 
 <file path=word/header1.xml><?xml version="1.0" encoding="utf-8"?>
-<w:hdr xmlns:wpc="http://schemas.microsoft.com/office/word/2010/wordprocessingCanvas" xmlns:mc="http://schemas.openxmlformats.org/markup-compatibility/2006" xmlns:o="urn:schemas-microsoft-com:office:office" xmlns:r="http://schemas.openxmlformats.org/officeDocument/2006/relationships" xmlns:m="http://schemas.openxmlformats.org/officeDocument/2006/math" xmlns:v="urn:schemas-microsoft-com:vml" xmlns:wp14="http://schemas.microsoft.com/office/word/2010/wordprocessingDrawing" xmlns:wp="http://schemas.openxmlformats.org/drawingml/2006/wordprocessingDrawing" xmlns:w10="urn:schemas-microsoft-com:office:word" xmlns:w="http://schemas.openxmlformats.org/wordprocessingml/2006/main" xmlns:w14="http://schemas.microsoft.com/office/word/2010/wordml" xmlns:w15="http://schemas.microsoft.com/office/word/2012/wordml" xmlns:wpg="http://schemas.microsoft.com/office/word/2010/wordprocessingGroup" xmlns:wpi="http://schemas.microsoft.com/office/word/2010/wordprocessingInk" xmlns:wne="http://schemas.microsoft.com/office/word/2006/wordml" xmlns:wps="http://schemas.microsoft.com/office/word/2010/wordprocessingShape" mc:Ignorable="w14 w15 wp14">
+<w:hdr xmlns:wpc="http://schemas.microsoft.com/office/word/2010/wordprocessingCanvas" xmlns:cx="http://schemas.microsoft.com/office/drawing/2014/chartex" xmlns:cx1="http://schemas.microsoft.com/office/drawing/2015/9/8/chartex" xmlns:cx2="http://schemas.microsoft.com/office/drawing/2015/10/21/chartex" xmlns:cx3="http://schemas.microsoft.com/office/drawing/2016/5/9/chartex" xmlns:cx4="http://schemas.microsoft.com/office/drawing/2016/5/10/chartex" xmlns:cx5="http://schemas.microsoft.com/office/drawing/2016/5/11/chartex" xmlns:cx6="http://schemas.microsoft.com/office/drawing/2016/5/12/chartex" xmlns:cx7="http://schemas.microsoft.com/office/drawing/2016/5/13/chartex" xmlns:cx8="http://schemas.microsoft.com/office/drawing/2016/5/14/chartex" xmlns:mc="http://schemas.openxmlformats.org/markup-compatibility/2006" xmlns:aink="http://schemas.microsoft.com/office/drawing/2016/ink" xmlns:am3d="http://schemas.microsoft.com/office/drawing/2017/model3d" xmlns:o="urn:schemas-microsoft-com:office:office" xmlns:oel="http://schemas.microsoft.com/office/2019/extlst" xmlns:r="http://schemas.openxmlformats.org/officeDocument/2006/relationships" xmlns:m="http://schemas.openxmlformats.org/officeDocument/2006/math" xmlns:v="urn:schemas-microsoft-com:vml" xmlns:wp14="http://schemas.microsoft.com/office/word/2010/wordprocessingDrawing" xmlns:wp="http://schemas.openxmlformats.org/drawingml/2006/wordprocessingDrawing" xmlns:w10="urn:schemas-microsoft-com:office:word" xmlns:w="http://schemas.openxmlformats.org/wordprocessingml/2006/main" xmlns:w14="http://schemas.microsoft.com/office/word/2010/wordml" xmlns:w15="http://schemas.microsoft.com/office/word/2012/wordml" xmlns:w16cex="http://schemas.microsoft.com/office/word/2018/wordml/cex" xmlns:w16cid="http://schemas.microsoft.com/office/word/2016/wordml/cid" xmlns:w16="http://schemas.microsoft.com/office/word/2018/wordml" xmlns:w16sdtdh="http://schemas.microsoft.com/office/word/2020/wordml/sdtdatahash" xmlns:w16se="http://schemas.microsoft.com/office/word/2015/wordml/symex" xmlns:wpg="http://schemas.microsoft.com/office/word/2010/wordprocessingGroup" xmlns:wpi="http://schemas.microsoft.com/office/word/2010/wordprocessingInk" xmlns:wne="http://schemas.microsoft.com/office/word/2006/wordml" xmlns:wps="http://schemas.microsoft.com/office/word/2010/wordprocessingShape" mc:Ignorable="w14 w15 w16se w16cid w16 w16cex w16sdtdh wp14">
   <w:p>
     <w:pPr>
       <w:pStyle w:val="Encabezado"/>
@@ -4490,7 +4507,7 @@
         <w:lang w:val="es-ES" w:eastAsia="es-ES"/>
       </w:rPr>
       <w:drawing>
-        <wp:anchor distT="0" distB="0" distL="114300" distR="114300" simplePos="0" relativeHeight="251658752" behindDoc="1" locked="0" layoutInCell="1" allowOverlap="1" wp14:anchorId="4344DA00" wp14:editId="436C150E">
+        <wp:anchor distT="0" distB="0" distL="114300" distR="114300" simplePos="0" relativeHeight="251658752" behindDoc="1" locked="0" layoutInCell="1" allowOverlap="1" wp14:anchorId="6D377D6D" wp14:editId="04D3A375">
           <wp:simplePos x="0" y="0"/>
           <wp:positionH relativeFrom="column">
             <wp:posOffset>0</wp:posOffset>
@@ -4562,7 +4579,7 @@
 </file>
 
 <file path=word/styles.xml><?xml version="1.0" encoding="utf-8"?>
-<w:styles xmlns:mc="http://schemas.openxmlformats.org/markup-compatibility/2006" xmlns:r="http://schemas.openxmlformats.org/officeDocument/2006/relationships" xmlns:w="http://schemas.openxmlformats.org/wordprocessingml/2006/main" xmlns:w14="http://schemas.microsoft.com/office/word/2010/wordml" xmlns:w15="http://schemas.microsoft.com/office/word/2012/wordml" mc:Ignorable="w14 w15">
+<w:styles xmlns:mc="http://schemas.openxmlformats.org/markup-compatibility/2006" xmlns:r="http://schemas.openxmlformats.org/officeDocument/2006/relationships" xmlns:w="http://schemas.openxmlformats.org/wordprocessingml/2006/main" xmlns:w14="http://schemas.microsoft.com/office/word/2010/wordml" xmlns:w15="http://schemas.microsoft.com/office/word/2012/wordml" xmlns:w16cex="http://schemas.microsoft.com/office/word/2018/wordml/cex" xmlns:w16cid="http://schemas.microsoft.com/office/word/2016/wordml/cid" xmlns:w16="http://schemas.microsoft.com/office/word/2018/wordml" xmlns:w16sdtdh="http://schemas.microsoft.com/office/word/2020/wordml/sdtdatahash" xmlns:w16se="http://schemas.microsoft.com/office/word/2015/wordml/symex" mc:Ignorable="w14 w15 w16se w16cid w16 w16cex w16sdtdh">
   <w:docDefaults>
     <w:rPrDefault>
       <w:rPr>
@@ -4578,7 +4595,7 @@
       </w:pPr>
     </w:pPrDefault>
   </w:docDefaults>
-  <w:latentStyles w:defLockedState="0" w:defUIPriority="99" w:defSemiHidden="0" w:defUnhideWhenUsed="0" w:defQFormat="0" w:count="371">
+  <w:latentStyles w:defLockedState="0" w:defUIPriority="99" w:defSemiHidden="0" w:defUnhideWhenUsed="0" w:defQFormat="0" w:count="376">
     <w:lsdException w:name="Normal" w:uiPriority="0" w:qFormat="1"/>
     <w:lsdException w:name="heading 1" w:uiPriority="9" w:qFormat="1"/>
     <w:lsdException w:name="heading 2" w:semiHidden="1" w:uiPriority="9" w:unhideWhenUsed="1" w:qFormat="1"/>
@@ -4684,7 +4701,6 @@
     <w:lsdException w:name="HTML Sample" w:semiHidden="1" w:unhideWhenUsed="1"/>
     <w:lsdException w:name="HTML Typewriter" w:semiHidden="1" w:unhideWhenUsed="1"/>
     <w:lsdException w:name="HTML Variable" w:semiHidden="1" w:unhideWhenUsed="1"/>
-    <w:lsdException w:name="Normal Table" w:semiHidden="1" w:unhideWhenUsed="1"/>
     <w:lsdException w:name="annotation subject" w:semiHidden="1" w:unhideWhenUsed="1"/>
     <w:lsdException w:name="No List" w:semiHidden="1" w:unhideWhenUsed="1"/>
     <w:lsdException w:name="Outline List 1" w:semiHidden="1" w:unhideWhenUsed="1"/>
@@ -4727,11 +4743,8 @@
     <w:lsdException w:name="Table Contemporary" w:semiHidden="1" w:unhideWhenUsed="1"/>
     <w:lsdException w:name="Table Elegant" w:semiHidden="1" w:unhideWhenUsed="1"/>
     <w:lsdException w:name="Table Professional" w:semiHidden="1" w:unhideWhenUsed="1"/>
-    <w:lsdException w:name="Table Subtle 1" w:semiHidden="1" w:unhideWhenUsed="1"/>
     <w:lsdException w:name="Table Subtle 2" w:semiHidden="1" w:unhideWhenUsed="1"/>
     <w:lsdException w:name="Table Web 1" w:semiHidden="1" w:unhideWhenUsed="1"/>
-    <w:lsdException w:name="Table Web 2" w:semiHidden="1" w:unhideWhenUsed="1"/>
-    <w:lsdException w:name="Table Web 3" w:semiHidden="1" w:unhideWhenUsed="1"/>
     <w:lsdException w:name="Balloon Text" w:semiHidden="1" w:unhideWhenUsed="1"/>
     <w:lsdException w:name="Table Grid" w:uiPriority="59"/>
     <w:lsdException w:name="Table Theme" w:semiHidden="1" w:unhideWhenUsed="1"/>
@@ -4950,6 +4963,11 @@
     <w:lsdException w:name="List Table 5 Dark Accent 6" w:uiPriority="50"/>
     <w:lsdException w:name="List Table 6 Colorful Accent 6" w:uiPriority="51"/>
     <w:lsdException w:name="List Table 7 Colorful Accent 6" w:uiPriority="52"/>
+    <w:lsdException w:name="Mention" w:semiHidden="1" w:unhideWhenUsed="1"/>
+    <w:lsdException w:name="Smart Hyperlink" w:semiHidden="1" w:unhideWhenUsed="1"/>
+    <w:lsdException w:name="Hashtag" w:semiHidden="1" w:unhideWhenUsed="1"/>
+    <w:lsdException w:name="Unresolved Mention" w:semiHidden="1" w:unhideWhenUsed="1"/>
+    <w:lsdException w:name="Smart Link" w:semiHidden="1" w:unhideWhenUsed="1"/>
   </w:latentStyles>
   <w:style w:type="paragraph" w:default="1" w:styleId="Normal">
     <w:name w:val="Normal"/>

</xml_diff>

<commit_message>
Anexo 3: periodo fijo, autorizado Economía, receptor editable, generación agrupada, reverso, movimientos declarados, cruce declarado↔calculado
</commit_message>
<xml_diff>
--- a/ActivosFijos/wwwroot/plantillas/Plantilla Anexo 3 Modelo de Mov de AFT. MODELO.docx
+++ b/ActivosFijos/wwwroot/plantillas/Plantilla Anexo 3 Modelo de Mov de AFT. MODELO.docx
@@ -102,25 +102,14 @@
               </w:rPr>
               <w:t xml:space="preserve">Entidad   </w:t>
             </w:r>
-            <w:proofErr w:type="spellStart"/>
-            <w:r>
-              <w:rPr>
-                <w:rFonts w:ascii="Arial" w:eastAsia="Times New Roman" w:hAnsi="Arial" w:cs="Arial"/>
-                <w:sz w:val="16"/>
-                <w:szCs w:val="16"/>
-                <w:lang w:val="es-ES" w:eastAsia="es-MX"/>
-              </w:rPr>
-              <w:t>ENTIDAD</w:t>
-            </w:r>
-            <w:proofErr w:type="spellEnd"/>
-            <w:r>
-              <w:rPr>
-                <w:rFonts w:ascii="Arial" w:eastAsia="Times New Roman" w:hAnsi="Arial" w:cs="Arial"/>
-                <w:sz w:val="16"/>
-                <w:szCs w:val="16"/>
-                <w:lang w:val="es-ES" w:eastAsia="es-MX"/>
-              </w:rPr>
-              <w:t>_</w:t>
+            <w:r>
+              <w:rPr>
+                <w:rFonts w:ascii="Arial" w:eastAsia="Times New Roman" w:hAnsi="Arial" w:cs="Arial"/>
+                <w:sz w:val="16"/>
+                <w:szCs w:val="16"/>
+                <w:lang w:val="es-ES" w:eastAsia="es-MX"/>
+              </w:rPr>
+              <w:t>ENTIDAD_</w:t>
             </w:r>
           </w:p>
         </w:tc>
@@ -145,7 +134,6 @@
                 <w:lang w:val="es-ES" w:eastAsia="es-MX"/>
               </w:rPr>
             </w:pPr>
-            <w:proofErr w:type="gramStart"/>
             <w:r>
               <w:rPr>
                 <w:rFonts w:ascii="Arial" w:eastAsia="Times New Roman" w:hAnsi="Arial" w:cs="Arial"/>
@@ -162,17 +150,7 @@
                 <w:szCs w:val="16"/>
                 <w:lang w:val="es-ES" w:eastAsia="es-MX"/>
               </w:rPr>
-              <w:t xml:space="preserve">  104</w:t>
-            </w:r>
-            <w:proofErr w:type="gramEnd"/>
-            <w:r>
-              <w:rPr>
-                <w:rFonts w:ascii="Arial" w:eastAsia="Times New Roman" w:hAnsi="Arial" w:cs="Arial"/>
-                <w:sz w:val="16"/>
-                <w:szCs w:val="16"/>
-                <w:lang w:val="es-ES" w:eastAsia="es-MX"/>
-              </w:rPr>
-              <w:t>-0-13532</w:t>
+              <w:t xml:space="preserve">  104-0-13532</w:t>
             </w:r>
           </w:p>
         </w:tc>
@@ -2494,27 +2472,7 @@
                 <w:szCs w:val="16"/>
                 <w:lang w:val="es-ES" w:eastAsia="es-MX"/>
               </w:rPr>
-              <w:t xml:space="preserve">Traspaso </w:t>
-            </w:r>
-            <w:proofErr w:type="spellStart"/>
-            <w:r>
-              <w:rPr>
-                <w:rFonts w:ascii="Arial" w:eastAsia="Times New Roman" w:hAnsi="Arial" w:cs="Arial"/>
-                <w:sz w:val="16"/>
-                <w:szCs w:val="16"/>
-                <w:lang w:val="es-ES" w:eastAsia="es-MX"/>
-              </w:rPr>
-              <w:t>efect</w:t>
-            </w:r>
-            <w:proofErr w:type="spellEnd"/>
-            <w:r>
-              <w:rPr>
-                <w:rFonts w:ascii="Arial" w:eastAsia="Times New Roman" w:hAnsi="Arial" w:cs="Arial"/>
-                <w:sz w:val="16"/>
-                <w:szCs w:val="16"/>
-                <w:lang w:val="es-ES" w:eastAsia="es-MX"/>
-              </w:rPr>
-              <w:t>.</w:t>
+              <w:t>Traspaso efect.</w:t>
             </w:r>
           </w:p>
         </w:tc>
@@ -2706,6 +2664,15 @@
               </w:rPr>
               <w:t xml:space="preserve">O </w:t>
             </w:r>
+            <w:r>
+              <w:rPr>
+                <w:rFonts w:ascii="Arial" w:eastAsia="Times New Roman" w:hAnsi="Arial" w:cs="Arial"/>
+                <w:sz w:val="16"/>
+                <w:szCs w:val="16"/>
+                <w:lang w:val="es-ES" w:eastAsia="es-MX"/>
+              </w:rPr>
+              <w:t>Traslado externo</w:t>
+            </w:r>
           </w:p>
         </w:tc>
         <w:tc>
@@ -3257,7 +3224,34 @@
                 <w:szCs w:val="16"/>
                 <w:lang w:val="es-ES" w:eastAsia="es-MX"/>
               </w:rPr>
-              <w:t>Director</w:t>
+              <w:t>CARGO</w:t>
+            </w:r>
+            <w:r>
+              <w:rPr>
+                <w:rFonts w:ascii="Arial" w:eastAsia="Times New Roman" w:hAnsi="Arial" w:cs="Arial"/>
+                <w:sz w:val="16"/>
+                <w:szCs w:val="16"/>
+                <w:lang w:val="es-ES" w:eastAsia="es-MX"/>
+              </w:rPr>
+              <w:t>APROBADO</w:t>
+            </w:r>
+            <w:r>
+              <w:rPr>
+                <w:rFonts w:ascii="Arial" w:eastAsia="Times New Roman" w:hAnsi="Arial" w:cs="Arial"/>
+                <w:sz w:val="16"/>
+                <w:szCs w:val="16"/>
+                <w:lang w:val="es-ES" w:eastAsia="es-MX"/>
+              </w:rPr>
+              <w:t>POR</w:t>
+            </w:r>
+            <w:r>
+              <w:rPr>
+                <w:rFonts w:ascii="Arial" w:eastAsia="Times New Roman" w:hAnsi="Arial" w:cs="Arial"/>
+                <w:sz w:val="16"/>
+                <w:szCs w:val="16"/>
+                <w:lang w:val="es-ES" w:eastAsia="es-MX"/>
+              </w:rPr>
+              <w:t>_</w:t>
             </w:r>
           </w:p>
         </w:tc>
@@ -3603,7 +3597,7 @@
                 <w:rFonts w:ascii="Arial" w:eastAsia="Times New Roman" w:hAnsi="Arial" w:cs="Arial"/>
                 <w:sz w:val="16"/>
                 <w:szCs w:val="16"/>
-                <w:lang w:val="es-ES" w:eastAsia="es-MX"/>
+                <w:lang w:eastAsia="es-MX"/>
               </w:rPr>
             </w:pPr>
             <w:r>
@@ -3622,7 +3616,7 @@
                 <w:szCs w:val="16"/>
                 <w:lang w:val="es-ES" w:eastAsia="es-MX"/>
               </w:rPr>
-              <w:t xml:space="preserve">EP-Economía </w:t>
+              <w:t>CARGOAUTORIZADOPOR_</w:t>
             </w:r>
           </w:p>
           <w:p>
@@ -4701,6 +4695,7 @@
     <w:lsdException w:name="HTML Sample" w:semiHidden="1" w:unhideWhenUsed="1"/>
     <w:lsdException w:name="HTML Typewriter" w:semiHidden="1" w:unhideWhenUsed="1"/>
     <w:lsdException w:name="HTML Variable" w:semiHidden="1" w:unhideWhenUsed="1"/>
+    <w:lsdException w:name="Normal Table" w:semiHidden="1" w:unhideWhenUsed="1"/>
     <w:lsdException w:name="annotation subject" w:semiHidden="1" w:unhideWhenUsed="1"/>
     <w:lsdException w:name="No List" w:semiHidden="1" w:unhideWhenUsed="1"/>
     <w:lsdException w:name="Outline List 1" w:semiHidden="1" w:unhideWhenUsed="1"/>
@@ -4743,8 +4738,11 @@
     <w:lsdException w:name="Table Contemporary" w:semiHidden="1" w:unhideWhenUsed="1"/>
     <w:lsdException w:name="Table Elegant" w:semiHidden="1" w:unhideWhenUsed="1"/>
     <w:lsdException w:name="Table Professional" w:semiHidden="1" w:unhideWhenUsed="1"/>
+    <w:lsdException w:name="Table Subtle 1" w:semiHidden="1" w:unhideWhenUsed="1"/>
     <w:lsdException w:name="Table Subtle 2" w:semiHidden="1" w:unhideWhenUsed="1"/>
     <w:lsdException w:name="Table Web 1" w:semiHidden="1" w:unhideWhenUsed="1"/>
+    <w:lsdException w:name="Table Web 2" w:semiHidden="1" w:unhideWhenUsed="1"/>
+    <w:lsdException w:name="Table Web 3" w:semiHidden="1" w:unhideWhenUsed="1"/>
     <w:lsdException w:name="Balloon Text" w:semiHidden="1" w:unhideWhenUsed="1"/>
     <w:lsdException w:name="Table Grid" w:uiPriority="59"/>
     <w:lsdException w:name="Table Theme" w:semiHidden="1" w:unhideWhenUsed="1"/>

</xml_diff>